<commit_message>
ia: tests multilingues du modele medical (francais) - erreur de terminologie detectee
</commit_message>
<xml_diff>
--- a/documentation/02-IA/medical_finetuning.docx
+++ b/documentation/02-IA/medical_finetuning.docx
@@ -759,6 +759,168 @@
         <w:pStyle w:val="Heading1"/>
       </w:pPr>
       <w:r>
+        <w:t xml:space="preserve">Tests conversationnels en français</w:t>
+      </w:r>
+    </w:p>
+    <w:p>
+      <w:pPr>
+        <w:spacing w:after="160"/>
+      </w:pPr>
+      <w:r>
+        <w:rPr>
+          <w:b w:val="false"/>
+          <w:bCs w:val="false"/>
+          <w:i w:val="false"/>
+          <w:iCs w:val="false"/>
+        </w:rPr>
+        <w:t xml:space="preserve">Le dataset d'entraînement est entièrement en anglais. Un test en français a été mené pour vérifier le comportement multilingue (pertinent pour TechCorp Industries) — le modèle n'a reçu aucun exemple français pendant le fine-tuning, la capacité à répondre en français vient du pré-entraînement multilingue du modèle de base Phi-3.5.</w:t>
+      </w:r>
+    </w:p>
+    <w:p>
+      <w:pPr>
+        <w:pStyle w:val="Heading2"/>
+      </w:pPr>
+      <w:r>
+        <w:t xml:space="preserve">Q : Quels sont les symptômes d'un rhume ?</w:t>
+      </w:r>
+    </w:p>
+    <w:p>
+      <w:pPr>
+        <w:spacing w:after="160"/>
+      </w:pPr>
+      <w:r>
+        <w:rPr>
+          <w:b w:val="false"/>
+          <w:bCs w:val="false"/>
+          <w:i w:val="false"/>
+          <w:iCs w:val="false"/>
+        </w:rPr>
+        <w:t xml:space="preserve">R : « Les symptômes courants d'un rhume, également connu sous le nom de rhume des foins, comprennent : nez qui coule, congestion nasale, maux de tête, sensibilité aux odeurs... »</w:t>
+      </w:r>
+    </w:p>
+    <w:p>
+      <w:pPr>
+        <w:spacing w:after="160"/>
+      </w:pPr>
+      <w:r>
+        <w:rPr>
+          <w:b/>
+          <w:bCs/>
+          <w:i w:val="false"/>
+          <w:iCs w:val="false"/>
+          <w:color w:val="C00000"/>
+        </w:rPr>
+        <w:t xml:space="preserve">⚠ Erreur de terminologie détectée : </w:t>
+      </w:r>
+      <w:r>
+        <w:rPr>
+          <w:b w:val="false"/>
+          <w:bCs w:val="false"/>
+          <w:i w:val="false"/>
+          <w:iCs w:val="false"/>
+        </w:rPr>
+        <w:t xml:space="preserve">le modèle confond "rhume" (rhume commun) avec "rhume des foins" (rhinite allergique), deux pathologies distinctes. Cette confusion n'apparaît pas dans la réponse équivalente en anglais, ce qui suggère une fiabilité réduite en français.</w:t>
+      </w:r>
+    </w:p>
+    <w:p>
+      <w:pPr>
+        <w:pStyle w:val="Heading2"/>
+      </w:pPr>
+      <w:r>
+        <w:t xml:space="preserve">Q : Qu'est-ce qu'une hernie discale ?</w:t>
+      </w:r>
+    </w:p>
+    <w:p>
+      <w:pPr>
+        <w:spacing w:after="160"/>
+      </w:pPr>
+      <w:r>
+        <w:rPr>
+          <w:b w:val="false"/>
+          <w:bCs w:val="false"/>
+          <w:i w:val="false"/>
+          <w:iCs w:val="false"/>
+        </w:rPr>
+        <w:t xml:space="preserve">R : « Une hernie discale, également connue sous le nom de protrusion discale ou de rupture discale, est un problème de santé où le noyau pulpeux d'un disque intervertébral s'échappe de l'anneau externe, exerçant une pression sur les racines nerveuses voisines... »</w:t>
+      </w:r>
+    </w:p>
+    <w:p>
+      <w:pPr>
+        <w:spacing w:after="160"/>
+      </w:pPr>
+      <w:r>
+        <w:rPr>
+          <w:b w:val="false"/>
+          <w:bCs w:val="false"/>
+          <w:i/>
+          <w:iCs/>
+        </w:rPr>
+        <w:t xml:space="preserve">→ Réponse cohérente, bien structurée et médicalement correcte.</w:t>
+      </w:r>
+    </w:p>
+    <w:p>
+      <w:pPr>
+        <w:pStyle w:val="Heading2"/>
+      </w:pPr>
+      <w:r>
+        <w:t xml:space="preserve">Q : J'ai mal à la tête depuis une semaine, que dois-je faire ?</w:t>
+      </w:r>
+    </w:p>
+    <w:p>
+      <w:pPr>
+        <w:spacing w:after="160"/>
+      </w:pPr>
+      <w:r>
+        <w:rPr>
+          <w:b w:val="false"/>
+          <w:bCs w:val="false"/>
+          <w:i w:val="false"/>
+          <w:iCs w:val="false"/>
+        </w:rPr>
+        <w:t xml:space="preserve">R : Liste structurée de causes potentielles (stress, mauvaise posture, migraine, pression intracrânienne, infection, médicaments, sommeil insuffisant, troubles neurologiques...).</w:t>
+      </w:r>
+    </w:p>
+    <w:p>
+      <w:pPr>
+        <w:spacing w:after="160"/>
+      </w:pPr>
+      <w:r>
+        <w:rPr>
+          <w:b w:val="false"/>
+          <w:bCs w:val="false"/>
+          <w:i/>
+          <w:iCs/>
+        </w:rPr>
+        <w:t xml:space="preserve">→ Réponse riche et bien organisée, cohérente avec la version anglaise du même test.</w:t>
+      </w:r>
+    </w:p>
+    <w:p>
+      <w:pPr>
+        <w:pStyle w:val="Heading2"/>
+      </w:pPr>
+      <w:r>
+        <w:t xml:space="preserve">Conclusion du test multilingue</w:t>
+      </w:r>
+    </w:p>
+    <w:p>
+      <w:pPr>
+        <w:spacing w:after="160"/>
+      </w:pPr>
+      <w:r>
+        <w:rPr>
+          <w:b w:val="false"/>
+          <w:bCs w:val="false"/>
+          <w:i w:val="false"/>
+          <w:iCs w:val="false"/>
+        </w:rPr>
+        <w:t xml:space="preserve">Le modèle répond de manière globalement cohérente en français malgré un fine-tuning uniquement anglophone, grâce au pré-entraînement multilingue de Phi-3.5. Cependant, l'erreur de terminologie relevée (rhume / rhume des foins) montre que la fiabilité factuelle est moins robuste en français qu'en anglais — un point à traiter avant tout déploiement auprès d'un public francophone.</w:t>
+      </w:r>
+    </w:p>
+    <w:p>
+      <w:pPr>
+        <w:pStyle w:val="Heading1"/>
+      </w:pPr>
+      <w:r>
         <w:t xml:space="preserve">Conclusion</w:t>
       </w:r>
     </w:p>
@@ -773,7 +935,7 @@
           <w:i w:val="false"/>
           <w:iCs w:val="false"/>
         </w:rPr>
-        <w:t xml:space="preserve">Le fine-tuning LoRA a fonctionné techniquement (loss en baisse, ton conversationnel médical acquis), mais le modèle reste expérimental et non déployable, conformément au brief : absence de garde-fous médicaux (recommandations de traitement non supervisées), échantillon d'entraînement réduit (500 exemples), et aucune validation par un professionnel de santé.</w:t>
+        <w:t xml:space="preserve">Le fine-tuning LoRA a fonctionné techniquement (loss en baisse, ton conversationnel médical acquis), mais le modèle reste expérimental et non déployable, conformément au brief : absence de garde-fous médicaux (recommandations de traitement non supervisées), échantillon d'entraînement réduit (500 exemples), aucune validation par un professionnel de santé, et fiabilité réduite en français (erreur de terminologie constatée).</w:t>
       </w:r>
     </w:p>
     <w:sectPr>

</xml_diff>